<commit_message>
Agregar pantalla de consulta de la bitacora de auditoria
Formularios/frmAuditoria.cs (Reporte -> Auditoria), pantalla de solo
lectura sobre Auditoria.ObtenerRegistros() (nueva, hasta 1000 filas mas
recientes del rango elegido), con filtro por Usuario, Entidad (combo
poblado dinamicamente con Auditoria.ObtenerEntidadesDistintas(), no una
lista fija) y rango de fechas (por defecto ultimos 30 dias). Exporta a
CSV igual que los demas reportes.

Nuevo permiso AUDITORIA, sembrado solo para Administrador. A proposito
no tiene boton de editar ni borrar: una bitacora que se puede alterar
desde su propia pantalla de consulta no sirve como bitacora.

Probado en vivo contra la base real: se ven las filas reales que ya
habia (facturas, ediciones de producto y datos de empresa, un cliente
creado, logins), y el filtro por Entidad = FACTURA devuelve exactamente
las facturas.

Manuales y documento de seguimiento actualizados.

Co-Authored-By: Claude Sonnet 5 <noreply@anthropic.com>
</commit_message>
<xml_diff>
--- a/MANUAL_USUARIO.docx
+++ b/MANUAL_USUARIO.docx
@@ -2780,6 +2780,42 @@
     </w:p>
     <w:p>
       <w:pPr>
+        <w:pStyle w:val="Heading2"/>
+      </w:pPr>
+      <w:r>
+        <w:t>Auditoría (solo administradores)</w:t>
+      </w:r>
+    </w:p>
+    <w:p>
+      <w:pPr/>
+      <w:r>
+        <w:t>Ve a Reporte → Auditoría para ver quién hizo qué y cuándo dentro del sistema: crear o editar un cliente/producto/usuario, guardar o anular una factura, hacer un pago, cambiar los permisos de un rol, entrar o salir del sistema, etc.</w:t>
+      </w:r>
+    </w:p>
+    <w:p>
+      <w:pPr>
+        <w:pStyle w:val="ListNumber"/>
+      </w:pPr>
+      <w:r>
+        <w:t>Filtra por Usuario, por Entidad (el tipo de cosa afectada, por ejemplo Factura o Cliente) y/o por un rango de fechas (por defecto muestra los últimos 30 días), y presiona Buscar.</w:t>
+      </w:r>
+    </w:p>
+    <w:p>
+      <w:pPr>
+        <w:pStyle w:val="ListNumber"/>
+      </w:pPr>
+      <w:r>
+        <w:t>Se pueden exportar los resultados a CSV con el botón Exportar, igual que los demás reportes.</w:t>
+      </w:r>
+    </w:p>
+    <w:p>
+      <w:pPr/>
+      <w:r>
+        <w:t>Nota: esta pantalla es solo de consulta -- no se puede editar ni borrar nada desde aquí, para que la bitácora siga siendo confiable.</w:t>
+      </w:r>
+    </w:p>
+    <w:p>
+      <w:pPr>
         <w:pStyle w:val="Heading1"/>
       </w:pPr>
       <w:r>

</xml_diff>